<commit_message>
feat(PROFARMA01): inserir 18 prints Azure DevOps em GCO, REV, ITP e PCP
Adição das evidências visuais do projeto Cadastro de Clientes (Rede D1000)
extraídas do repositório Azure DevOps, cobrindo lacunas de conformidade MPS-SW:

- GCO v1.1 — §8: tags de baseline (2024-2025 e 2026) + estrutura de branches Git Flow
- REV v1.1 — §5 REV-004: PRs 3 e 4 aprovados + histórico de commits out/2025
- ITP v1.1 — §7.1.1: histórico de runs do pipeline + stages (2 branches)
- PCP v1.6 — §12: estrutura da solution (28 projetos, Clean Architecture) + commits Call Center

Converter atualizado para suportar sintaxe Markdown de imagem ![caption](path).
18 prints adicionados em _interno/evidencias-profarma-cezar/azure-devops/.

Lacunas cobertas: GCO2 (branches), GCO3 (tags), VV2 (PRs), ITP2 (pipeline stages),
PCP1 (estrutura Clean Architecture), PCP2 (commits de implementação).

https://claude.ai/code/session_01S1uaRCKUZijEzczGbWvNWD
</commit_message>
<xml_diff>
--- a/mps-nivel-c/oficial/04_registros/PROFARMA_Cadastro-de-Clientes/GCO-PROFARMA01-001_Registro-de-Gerencia-de-Configuracao.docx
+++ b/mps-nivel-c/oficial/04_registros/PROFARMA_Cadastro-de-Clientes/GCO-PROFARMA01-001_Registro-de-Gerencia-de-Configuracao.docx
@@ -6653,6 +6653,347 @@
         </w:pBdr>
       </w:pPr>
       <w:r>
+        <w:t>8. Evidências de controle de configuração (Azure DevOps)</w:t>
+      </w:r>
+    </w:p>
+    <w:p>
+      <w:pPr>
+        <w:pStyle w:val="Heading2"/>
+        <w:keepNext/>
+        <w:keepLines/>
+      </w:pPr>
+      <w:r>
+        <w:t>8.1 Tags de baseline — repositório loja-backend</w:t>
+      </w:r>
+    </w:p>
+    <w:p>
+      <w:pPr>
+        <w:spacing w:before="0" w:after="120"/>
+      </w:pPr>
+      <w:r>
+        <w:rPr>
+          <w:rFonts w:ascii="Calibri" w:hAnsi="Calibri"/>
+          <w:b w:val="0"/>
+          <w:i w:val="0"/>
+          <w:sz w:val="22"/>
+        </w:rPr>
+        <w:t>Tags geradas ao longo do ciclo de vida do projeto, evidenciando GCO3 (baselines nos marcos do projeto).</w:t>
+      </w:r>
+    </w:p>
+    <w:p>
+      <w:pPr>
+        <w:spacing w:before="0" w:after="120"/>
+      </w:pPr>
+      <w:r>
+        <w:rPr>
+          <w:rFonts w:ascii="Calibri" w:hAnsi="Calibri"/>
+          <w:b/>
+          <w:i w:val="0"/>
+          <w:sz w:val="22"/>
+        </w:rPr>
+        <w:t>Tags 2024–2025 (24.4.1.1 a 25.11.1.1):</w:t>
+      </w:r>
+    </w:p>
+    <w:p>
+      <w:pPr>
+        <w:spacing w:before="120" w:after="40"/>
+        <w:jc w:val="center"/>
+      </w:pPr>
+      <w:r>
+        <w:drawing>
+          <wp:inline xmlns:a="http://schemas.openxmlformats.org/drawingml/2006/main" xmlns:pic="http://schemas.openxmlformats.org/drawingml/2006/picture">
+            <wp:extent cx="5029200" cy="4120563"/>
+            <wp:docPr id="1" name="Picture 1"/>
+            <wp:cNvGraphicFramePr>
+              <a:graphicFrameLocks noChangeAspect="1"/>
+            </wp:cNvGraphicFramePr>
+            <a:graphic>
+              <a:graphicData uri="http://schemas.openxmlformats.org/drawingml/2006/picture">
+                <pic:pic>
+                  <pic:nvPicPr>
+                    <pic:cNvPr id="0" name="azuredevops-tags-baseline-2024-2025.png"/>
+                    <pic:cNvPicPr/>
+                  </pic:nvPicPr>
+                  <pic:blipFill>
+                    <a:blip r:embed="rId13"/>
+                    <a:stretch>
+                      <a:fillRect/>
+                    </a:stretch>
+                  </pic:blipFill>
+                  <pic:spPr>
+                    <a:xfrm>
+                      <a:off x="0" y="0"/>
+                      <a:ext cx="5029200" cy="4120563"/>
+                    </a:xfrm>
+                    <a:prstGeom prst="rect"/>
+                  </pic:spPr>
+                </pic:pic>
+              </a:graphicData>
+            </a:graphic>
+          </wp:inline>
+        </w:drawing>
+      </w:r>
+    </w:p>
+    <w:p>
+      <w:pPr>
+        <w:spacing w:before="0" w:after="200"/>
+        <w:jc w:val="center"/>
+      </w:pPr>
+      <w:r>
+        <w:rPr>
+          <w:rFonts w:ascii="Calibri" w:hAnsi="Calibri"/>
+          <w:i/>
+          <w:color w:val="555555"/>
+          <w:sz w:val="18"/>
+        </w:rPr>
+        <w:t>Tags de baseline 2024–2025 (24.4.1.1, 24.4.1.9, 24.4.1.10, 24.4.1.11, 24.9.1.2, 25.1.1.1, 25.2.1.1, 25.10.2.1, 25.11.1.1) — Azure DevOps loja-backend</w:t>
+      </w:r>
+    </w:p>
+    <w:p>
+      <w:pPr>
+        <w:spacing w:before="0" w:after="120"/>
+      </w:pPr>
+      <w:r>
+        <w:rPr>
+          <w:rFonts w:ascii="Calibri" w:hAnsi="Calibri"/>
+          <w:b/>
+          <w:i w:val="0"/>
+          <w:sz w:val="22"/>
+        </w:rPr>
+        <w:t>Tags 2026 — pós go-live (26.1.1.1 a 26.3.2.1):</w:t>
+      </w:r>
+    </w:p>
+    <w:p>
+      <w:pPr>
+        <w:spacing w:before="120" w:after="40"/>
+        <w:jc w:val="center"/>
+      </w:pPr>
+      <w:r>
+        <w:drawing>
+          <wp:inline xmlns:a="http://schemas.openxmlformats.org/drawingml/2006/main" xmlns:pic="http://schemas.openxmlformats.org/drawingml/2006/picture">
+            <wp:extent cx="5029200" cy="4175381"/>
+            <wp:docPr id="2" name="Picture 2"/>
+            <wp:cNvGraphicFramePr>
+              <a:graphicFrameLocks noChangeAspect="1"/>
+            </wp:cNvGraphicFramePr>
+            <a:graphic>
+              <a:graphicData uri="http://schemas.openxmlformats.org/drawingml/2006/picture">
+                <pic:pic>
+                  <pic:nvPicPr>
+                    <pic:cNvPr id="0" name="azuredevops-tags-baseline-2026.png"/>
+                    <pic:cNvPicPr/>
+                  </pic:nvPicPr>
+                  <pic:blipFill>
+                    <a:blip r:embed="rId14"/>
+                    <a:stretch>
+                      <a:fillRect/>
+                    </a:stretch>
+                  </pic:blipFill>
+                  <pic:spPr>
+                    <a:xfrm>
+                      <a:off x="0" y="0"/>
+                      <a:ext cx="5029200" cy="4175381"/>
+                    </a:xfrm>
+                    <a:prstGeom prst="rect"/>
+                  </pic:spPr>
+                </pic:pic>
+              </a:graphicData>
+            </a:graphic>
+          </wp:inline>
+        </w:drawing>
+      </w:r>
+    </w:p>
+    <w:p>
+      <w:pPr>
+        <w:spacing w:before="0" w:after="200"/>
+        <w:jc w:val="center"/>
+      </w:pPr>
+      <w:r>
+        <w:rPr>
+          <w:rFonts w:ascii="Calibri" w:hAnsi="Calibri"/>
+          <w:i/>
+          <w:color w:val="555555"/>
+          <w:sz w:val="18"/>
+        </w:rPr>
+        <w:t>Tags de baseline 2026 (26.1.1.1, 26.1.1.1-cadastro-clientes, 26.1.1.2, 26.1.1.3, 26.2.1.1, 26.3.1.2, 26.3.1.3, 26.3.2.1) — Azure DevOps loja-backend</w:t>
+      </w:r>
+    </w:p>
+    <w:p>
+      <w:pPr>
+        <w:pStyle w:val="Heading2"/>
+        <w:keepNext/>
+        <w:keepLines/>
+      </w:pPr>
+      <w:r>
+        <w:t>8.2 Branches — estrutura Git Flow</w:t>
+      </w:r>
+    </w:p>
+    <w:p>
+      <w:pPr>
+        <w:spacing w:before="0" w:after="120"/>
+      </w:pPr>
+      <w:r>
+        <w:rPr>
+          <w:rFonts w:ascii="Calibri" w:hAnsi="Calibri"/>
+          <w:b/>
+          <w:i w:val="0"/>
+          <w:sz w:val="22"/>
+        </w:rPr>
+        <w:t>Grupos feature/, fix/, hotfix/, release/ e branches de trabalho ativo:</w:t>
+      </w:r>
+    </w:p>
+    <w:p>
+      <w:pPr>
+        <w:spacing w:before="120" w:after="40"/>
+        <w:jc w:val="center"/>
+      </w:pPr>
+      <w:r>
+        <w:drawing>
+          <wp:inline xmlns:a="http://schemas.openxmlformats.org/drawingml/2006/main" xmlns:pic="http://schemas.openxmlformats.org/drawingml/2006/picture">
+            <wp:extent cx="5029200" cy="3308544"/>
+            <wp:docPr id="3" name="Picture 3"/>
+            <wp:cNvGraphicFramePr>
+              <a:graphicFrameLocks noChangeAspect="1"/>
+            </wp:cNvGraphicFramePr>
+            <a:graphic>
+              <a:graphicData uri="http://schemas.openxmlformats.org/drawingml/2006/picture">
+                <pic:pic>
+                  <pic:nvPicPr>
+                    <pic:cNvPr id="0" name="azuredevops-branches-estrutura-feature-fix-hotfix.png"/>
+                    <pic:cNvPicPr/>
+                  </pic:nvPicPr>
+                  <pic:blipFill>
+                    <a:blip r:embed="rId15"/>
+                    <a:stretch>
+                      <a:fillRect/>
+                    </a:stretch>
+                  </pic:blipFill>
+                  <pic:spPr>
+                    <a:xfrm>
+                      <a:off x="0" y="0"/>
+                      <a:ext cx="5029200" cy="3308544"/>
+                    </a:xfrm>
+                    <a:prstGeom prst="rect"/>
+                  </pic:spPr>
+                </pic:pic>
+              </a:graphicData>
+            </a:graphic>
+          </wp:inline>
+        </w:drawing>
+      </w:r>
+    </w:p>
+    <w:p>
+      <w:pPr>
+        <w:spacing w:before="0" w:after="200"/>
+        <w:jc w:val="center"/>
+      </w:pPr>
+      <w:r>
+        <w:rPr>
+          <w:rFonts w:ascii="Calibri" w:hAnsi="Calibri"/>
+          <w:i/>
+          <w:color w:val="555555"/>
+          <w:sz w:val="18"/>
+        </w:rPr>
+        <w:t>Branches: grupos feature/, fix/, hotfix/, release/ e branches Ajuste_OptIn_OptOut, ajuste_termoaceite, ajustes_cadastrais, Segmentacao_Clientes; develop (Default) — Azure DevOps</w:t>
+      </w:r>
+    </w:p>
+    <w:p>
+      <w:pPr>
+        <w:spacing w:before="0" w:after="120"/>
+      </w:pPr>
+      <w:r>
+        <w:rPr>
+          <w:rFonts w:ascii="Calibri" w:hAnsi="Calibri"/>
+          <w:b w:val="0"/>
+          <w:i w:val="0"/>
+          <w:sz w:val="22"/>
+        </w:rPr>
+        <w:t>*</w:t>
+      </w:r>
+      <w:r>
+        <w:rPr>
+          <w:rFonts w:ascii="Calibri" w:hAnsi="Calibri"/>
+          <w:b w:val="0"/>
+          <w:i/>
+          <w:sz w:val="22"/>
+        </w:rPr>
+        <w:t>Branches feature/</w:t>
+      </w:r>
+      <w:r>
+        <w:rPr>
+          <w:rFonts w:ascii="Calibri" w:hAnsi="Calibri"/>
+          <w:b w:val="0"/>
+          <w:i w:val="0"/>
+          <w:sz w:val="22"/>
+        </w:rPr>
+        <w:t xml:space="preserve"> expandido — nomenclatura rastreável:**</w:t>
+      </w:r>
+    </w:p>
+    <w:p>
+      <w:pPr>
+        <w:spacing w:before="120" w:after="40"/>
+        <w:jc w:val="center"/>
+      </w:pPr>
+      <w:r>
+        <w:drawing>
+          <wp:inline xmlns:a="http://schemas.openxmlformats.org/drawingml/2006/main" xmlns:pic="http://schemas.openxmlformats.org/drawingml/2006/picture">
+            <wp:extent cx="5029200" cy="3991429"/>
+            <wp:docPr id="4" name="Picture 4"/>
+            <wp:cNvGraphicFramePr>
+              <a:graphicFrameLocks noChangeAspect="1"/>
+            </wp:cNvGraphicFramePr>
+            <a:graphic>
+              <a:graphicData uri="http://schemas.openxmlformats.org/drawingml/2006/picture">
+                <pic:pic>
+                  <pic:nvPicPr>
+                    <pic:cNvPr id="0" name="azuredevops-branches-feature-detalhes.png"/>
+                    <pic:cNvPicPr/>
+                  </pic:nvPicPr>
+                  <pic:blipFill>
+                    <a:blip r:embed="rId16"/>
+                    <a:stretch>
+                      <a:fillRect/>
+                    </a:stretch>
+                  </pic:blipFill>
+                  <pic:spPr>
+                    <a:xfrm>
+                      <a:off x="0" y="0"/>
+                      <a:ext cx="5029200" cy="3991429"/>
+                    </a:xfrm>
+                    <a:prstGeom prst="rect"/>
+                  </pic:spPr>
+                </pic:pic>
+              </a:graphicData>
+            </a:graphic>
+          </wp:inline>
+        </w:drawing>
+      </w:r>
+    </w:p>
+    <w:p>
+      <w:pPr>
+        <w:spacing w:before="0" w:after="200"/>
+        <w:jc w:val="center"/>
+      </w:pPr>
+      <w:r>
+        <w:rPr>
+          <w:rFonts w:ascii="Calibri" w:hAnsi="Calibri"/>
+          <w:i/>
+          <w:color w:val="555555"/>
+          <w:sz w:val="18"/>
+        </w:rPr>
+        <w:t>Branches feature/*: database-profarma-der, initial-setup, migration-console-app, playwright-e2e-tests, requisitos-funcionais-completos, user-authentication, validacoes-robustas — Azure DevOps</w:t>
+      </w:r>
+    </w:p>
+    <w:p>
+      <w:pPr>
+        <w:pStyle w:val="Heading1"/>
+        <w:keepNext/>
+        <w:keepLines/>
+        <w:pBdr>
+          <w:bottom w:val="single" w:sz="4" w:space="2" w:color="D6E4F0"/>
+        </w:pBdr>
+      </w:pPr>
+      <w:r>
         <w:t>Histórico de revisões</w:t>
       </w:r>
     </w:p>
@@ -6886,6 +7227,112 @@
                 <w:sz w:val="20"/>
               </w:rPr>
               <w:t>Versão inicial — reconstituída consolidando o controle de configuração exercido durante o projeto</w:t>
+            </w:r>
+          </w:p>
+        </w:tc>
+      </w:tr>
+      <w:tr>
+        <w:trPr>
+          <w:cantSplit w:val="1"/>
+        </w:trPr>
+        <w:tc>
+          <w:tcPr>
+            <w:tcW w:type="dxa" w:w="2225"/>
+            <w:tcMar>
+              <w:top w:w="60" w:type="dxa"/>
+              <w:bottom w:w="60" w:type="dxa"/>
+              <w:left w:w="100" w:type="dxa"/>
+              <w:right w:w="100" w:type="dxa"/>
+            </w:tcMar>
+            <w:shd w:val="clear" w:color="auto" w:fill="F0F4F8"/>
+          </w:tcPr>
+          <w:p>
+            <w:pPr>
+              <w:spacing w:before="40" w:after="40"/>
+            </w:pPr>
+            <w:r>
+              <w:rPr>
+                <w:rFonts w:ascii="Calibri" w:hAnsi="Calibri"/>
+                <w:b/>
+                <w:i w:val="0"/>
+                <w:sz w:val="20"/>
+              </w:rPr>
+              <w:t>1.1</w:t>
+            </w:r>
+          </w:p>
+        </w:tc>
+        <w:tc>
+          <w:tcPr>
+            <w:tcW w:type="dxa" w:w="2225"/>
+            <w:tcMar>
+              <w:top w:w="60" w:type="dxa"/>
+              <w:bottom w:w="60" w:type="dxa"/>
+              <w:left w:w="100" w:type="dxa"/>
+              <w:right w:w="100" w:type="dxa"/>
+            </w:tcMar>
+          </w:tcPr>
+          <w:p>
+            <w:pPr>
+              <w:spacing w:before="40" w:after="40"/>
+            </w:pPr>
+            <w:r>
+              <w:rPr>
+                <w:rFonts w:ascii="Calibri" w:hAnsi="Calibri"/>
+                <w:b w:val="0"/>
+                <w:i w:val="0"/>
+                <w:sz w:val="20"/>
+              </w:rPr>
+              <w:t>15/06/2026</w:t>
+            </w:r>
+          </w:p>
+        </w:tc>
+        <w:tc>
+          <w:tcPr>
+            <w:tcW w:type="dxa" w:w="2225"/>
+            <w:tcMar>
+              <w:top w:w="60" w:type="dxa"/>
+              <w:bottom w:w="60" w:type="dxa"/>
+              <w:left w:w="100" w:type="dxa"/>
+              <w:right w:w="100" w:type="dxa"/>
+            </w:tcMar>
+          </w:tcPr>
+          <w:p>
+            <w:pPr>
+              <w:spacing w:before="40" w:after="40"/>
+            </w:pPr>
+            <w:r>
+              <w:rPr>
+                <w:rFonts w:ascii="Calibri" w:hAnsi="Calibri"/>
+                <w:b w:val="0"/>
+                <w:i w:val="0"/>
+                <w:sz w:val="20"/>
+              </w:rPr>
+              <w:t>Time de Melhoria Contínua</w:t>
+            </w:r>
+          </w:p>
+        </w:tc>
+        <w:tc>
+          <w:tcPr>
+            <w:tcW w:type="dxa" w:w="2225"/>
+            <w:tcMar>
+              <w:top w:w="60" w:type="dxa"/>
+              <w:bottom w:w="60" w:type="dxa"/>
+              <w:left w:w="100" w:type="dxa"/>
+              <w:right w:w="100" w:type="dxa"/>
+            </w:tcMar>
+          </w:tcPr>
+          <w:p>
+            <w:pPr>
+              <w:spacing w:before="40" w:after="40"/>
+            </w:pPr>
+            <w:r>
+              <w:rPr>
+                <w:rFonts w:ascii="Calibri" w:hAnsi="Calibri"/>
+                <w:b w:val="0"/>
+                <w:i w:val="0"/>
+                <w:sz w:val="20"/>
+              </w:rPr>
+              <w:t>Adição de §8 com evidências visuais de tags de baseline e branches do Azure DevOps</w:t>
             </w:r>
           </w:p>
         </w:tc>

</xml_diff>